<commit_message>
Subido última versión de Capitlo 1 V3
</commit_message>
<xml_diff>
--- a/Capitulo 1 - INTRODUCCIÓN A LA IAGEN/ResumenCapitulo1_EC_V2.0Refrexion.docx
+++ b/Capitulo 1 - INTRODUCCIÓN A LA IAGEN/ResumenCapitulo1_EC_V2.0Refrexion.docx
@@ -3829,6 +3829,7 @@
     </w:p>
     <w:p>
       <w:pPr>
+        <w:jc w:val="both"/>
         <w:rPr>
           <w:rFonts w:ascii="Arial" w:eastAsia="Arial" w:hAnsi="Arial" w:cs="Arial"/>
         </w:rPr>
@@ -3842,6 +3843,7 @@
     </w:p>
     <w:p>
       <w:pPr>
+        <w:jc w:val="both"/>
         <w:rPr>
           <w:rFonts w:ascii="Arial" w:eastAsia="Arial" w:hAnsi="Arial" w:cs="Arial"/>
         </w:rPr>
@@ -3875,19 +3877,18 @@
         </w:numPr>
         <w:rPr>
           <w:rFonts w:ascii="Arial" w:eastAsia="Arial" w:hAnsi="Arial" w:cs="Arial"/>
-          <w:highlight w:val="yellow"/>
-        </w:rPr>
-      </w:pPr>
-      <w:r>
-        <w:rPr>
-          <w:rFonts w:ascii="Arial" w:eastAsia="Arial" w:hAnsi="Arial" w:cs="Arial"/>
-          <w:highlight w:val="yellow"/>
+        </w:rPr>
+      </w:pPr>
+      <w:r>
+        <w:rPr>
+          <w:rFonts w:ascii="Arial" w:eastAsia="Arial" w:hAnsi="Arial" w:cs="Arial"/>
         </w:rPr>
         <w:t>¿Cómo modifica la Inteligencia Artificial Generativa las competencias que debe desarrollar un ingeniero de software durante las primeras etapas de su formación profesional?</w:t>
       </w:r>
     </w:p>
     <w:p>
       <w:pPr>
+        <w:jc w:val="both"/>
         <w:rPr>
           <w:rFonts w:ascii="Arial" w:eastAsia="Arial" w:hAnsi="Arial" w:cs="Arial"/>
         </w:rPr>
@@ -3919,6 +3920,7 @@
     </w:p>
     <w:p>
       <w:pPr>
+        <w:jc w:val="both"/>
         <w:rPr>
           <w:rFonts w:ascii="Arial" w:eastAsia="Arial" w:hAnsi="Arial" w:cs="Arial"/>
         </w:rPr>
@@ -3945,33 +3947,30 @@
         </w:numPr>
         <w:rPr>
           <w:rFonts w:ascii="Arial" w:eastAsia="Arial" w:hAnsi="Arial" w:cs="Arial"/>
-          <w:highlight w:val="yellow"/>
-        </w:rPr>
-      </w:pPr>
-      <w:r>
-        <w:rPr>
-          <w:rFonts w:ascii="Arial" w:eastAsia="Arial" w:hAnsi="Arial" w:cs="Arial"/>
-          <w:highlight w:val="yellow"/>
+        </w:rPr>
+      </w:pPr>
+      <w:r>
+        <w:rPr>
+          <w:rFonts w:ascii="Arial" w:eastAsia="Arial" w:hAnsi="Arial" w:cs="Arial"/>
         </w:rPr>
         <w:t>¿Qué riesgos pueden presentarse al incorporar código generado por IA</w:t>
       </w:r>
       <w:r>
         <w:rPr>
           <w:rFonts w:ascii="Arial" w:eastAsia="Arial" w:hAnsi="Arial" w:cs="Arial"/>
-          <w:highlight w:val="yellow"/>
         </w:rPr>
         <w:t>Gen</w:t>
       </w:r>
       <w:r>
         <w:rPr>
           <w:rFonts w:ascii="Arial" w:eastAsia="Arial" w:hAnsi="Arial" w:cs="Arial"/>
-          <w:highlight w:val="yellow"/>
         </w:rPr>
         <w:t xml:space="preserve"> sin un proceso adecuado de revisión y validación?</w:t>
       </w:r>
     </w:p>
     <w:p>
       <w:pPr>
+        <w:jc w:val="both"/>
         <w:rPr>
           <w:rFonts w:ascii="Arial" w:eastAsia="Arial" w:hAnsi="Arial" w:cs="Arial"/>
         </w:rPr>
@@ -3991,15 +3990,30 @@
     </w:p>
     <w:p>
       <w:pPr>
-        <w:rPr>
-          <w:rFonts w:ascii="Arial" w:eastAsia="Arial" w:hAnsi="Arial" w:cs="Arial"/>
-        </w:rPr>
-      </w:pPr>
-      <w:r>
-        <w:rPr>
-          <w:rFonts w:ascii="Arial" w:eastAsia="Arial" w:hAnsi="Arial" w:cs="Arial"/>
-        </w:rPr>
-        <w:t>Asimismo, este código puede arrastrar dependencias innecesarias, generar inconsistencias lógicas o dificultar la trazabilidad de fallos en etapas posteriores al ciclo de desarrollo. Debido a esto, cualquier recurso generado por IAGen no debe ser trasladado directamente a producción, sin antes ser sometido a una revisión técnica exhaustiva, pruebas unitarias y una depuración rigurosa garantizando su calidad, robustez y compatibilidad con la arquitectura del sistema.</w:t>
+        <w:jc w:val="both"/>
+        <w:rPr>
+          <w:rFonts w:ascii="Arial" w:eastAsia="Arial" w:hAnsi="Arial" w:cs="Arial"/>
+        </w:rPr>
+      </w:pPr>
+      <w:r>
+        <w:rPr>
+          <w:rFonts w:ascii="Arial" w:eastAsia="Arial" w:hAnsi="Arial" w:cs="Arial"/>
+        </w:rPr>
+        <w:t xml:space="preserve">Asimismo, este código puede arrastrar dependencias innecesarias, generar inconsistencias lógicas o dificultar la trazabilidad de fallos en etapas posteriores al ciclo de desarrollo. Debido a esto, cualquier recurso generado por IAGen no debe ser trasladado directamente a producción, sin antes ser sometido a una revisión técnica exhaustiva, </w:t>
+      </w:r>
+      <w:r>
+        <w:rPr>
+          <w:rFonts w:ascii="Arial" w:eastAsia="Arial" w:hAnsi="Arial" w:cs="Arial"/>
+          <w:i/>
+          <w:iCs/>
+        </w:rPr>
+        <w:t>pruebas unitarias</w:t>
+      </w:r>
+      <w:r>
+        <w:rPr>
+          <w:rFonts w:ascii="Arial" w:eastAsia="Arial" w:hAnsi="Arial" w:cs="Arial"/>
+        </w:rPr>
+        <w:t xml:space="preserve"> y una depuración rigurosa garantizando su calidad, robustez y compatibilidad con la arquitectura del sistema.</w:t>
       </w:r>
     </w:p>
     <w:p>
@@ -4011,13 +4025,11 @@
         </w:numPr>
         <w:rPr>
           <w:rFonts w:ascii="Arial" w:eastAsia="Arial" w:hAnsi="Arial" w:cs="Arial"/>
-          <w:highlight w:val="yellow"/>
-        </w:rPr>
-      </w:pPr>
-      <w:r>
-        <w:rPr>
-          <w:rFonts w:ascii="Arial" w:eastAsia="Arial" w:hAnsi="Arial" w:cs="Arial"/>
-          <w:highlight w:val="yellow"/>
+        </w:rPr>
+      </w:pPr>
+      <w:r>
+        <w:rPr>
+          <w:rFonts w:ascii="Arial" w:eastAsia="Arial" w:hAnsi="Arial" w:cs="Arial"/>
         </w:rPr>
         <w:lastRenderedPageBreak/>
         <w:t xml:space="preserve">¿De qué manera la automatización mediante </w:t>
@@ -4025,86 +4037,92 @@
       <w:r>
         <w:rPr>
           <w:rFonts w:ascii="Arial" w:eastAsia="Arial" w:hAnsi="Arial" w:cs="Arial"/>
-          <w:highlight w:val="yellow"/>
         </w:rPr>
         <w:t>Arquitectura de Diseño</w:t>
       </w:r>
       <w:r>
         <w:rPr>
           <w:rFonts w:ascii="Arial" w:eastAsia="Arial" w:hAnsi="Arial" w:cs="Arial"/>
-          <w:highlight w:val="yellow"/>
         </w:rPr>
         <w:t xml:space="preserve"> como Código puede contribuir a mejorar la eficiencia y la seguridad en entornos</w:t>
       </w:r>
       <w:r>
         <w:rPr>
           <w:rFonts w:ascii="Arial" w:eastAsia="Arial" w:hAnsi="Arial" w:cs="Arial"/>
-          <w:highlight w:val="yellow"/>
         </w:rPr>
         <w:t xml:space="preserve"> </w:t>
       </w:r>
       <w:r>
         <w:rPr>
           <w:rFonts w:ascii="Arial" w:eastAsia="Arial" w:hAnsi="Arial" w:cs="Arial"/>
-          <w:highlight w:val="yellow"/>
         </w:rPr>
         <w:t>de desarrollo como NetBeans</w:t>
       </w:r>
       <w:r>
         <w:rPr>
           <w:rFonts w:ascii="Arial" w:eastAsia="Arial" w:hAnsi="Arial" w:cs="Arial"/>
-          <w:highlight w:val="yellow"/>
         </w:rPr>
         <w:t>?</w:t>
       </w:r>
     </w:p>
     <w:p>
       <w:pPr>
-        <w:rPr>
-          <w:rFonts w:ascii="Arial" w:eastAsia="Arial" w:hAnsi="Arial" w:cs="Arial"/>
-        </w:rPr>
-      </w:pPr>
-      <w:r>
-        <w:rPr>
-          <w:rFonts w:ascii="Arial" w:eastAsia="Arial" w:hAnsi="Arial" w:cs="Arial"/>
-        </w:rPr>
-        <w:t xml:space="preserve">En distintos entornos de desarrollo como NetBeans, la automatización mediante arquitectura de diseño como código, optimiza el ciclo de desarrollo en 2 aspectos clave: </w:t>
-      </w:r>
-    </w:p>
-    <w:p>
-      <w:pPr>
-        <w:pStyle w:val="Prrafodelista"/>
-        <w:numPr>
-          <w:ilvl w:val="0"/>
-          <w:numId w:val="11"/>
-        </w:numPr>
-        <w:rPr>
-          <w:rFonts w:ascii="Arial" w:eastAsia="Arial" w:hAnsi="Arial" w:cs="Arial"/>
-        </w:rPr>
-      </w:pPr>
-      <w:r>
-        <w:rPr>
-          <w:rFonts w:ascii="Arial" w:eastAsia="Arial" w:hAnsi="Arial" w:cs="Arial"/>
-        </w:rPr>
-        <w:t>Eficiencia en la estructuración del proyecto: Permite automatizar la creación del andamiaje base, paquetes, interfaces y dependencias dentro del IDE. Esto ahorra tiempo en tareas repetitivas de configuración inicial y asegura que el proyecto cumpla de forma consistente con los patrones arquitectónicos establecidos, como, por ejemplo, MVC (Model – View – Controller).</w:t>
-      </w:r>
-    </w:p>
-    <w:p>
-      <w:pPr>
-        <w:pStyle w:val="Prrafodelista"/>
-        <w:numPr>
-          <w:ilvl w:val="0"/>
-          <w:numId w:val="11"/>
-        </w:numPr>
-        <w:rPr>
-          <w:rFonts w:ascii="Arial" w:eastAsia="Arial" w:hAnsi="Arial" w:cs="Arial"/>
-        </w:rPr>
-      </w:pPr>
-      <w:r>
-        <w:rPr>
-          <w:rFonts w:ascii="Arial" w:eastAsia="Arial" w:hAnsi="Arial" w:cs="Arial"/>
-        </w:rPr>
-        <w:t>Seguridad y estandarización técnica: Reduce los errores humanos derivados por configuraciones manuales propensas a fallos en el IDE. Al estandarizar la estructura de código y los flujos de compilación/pruebas, estas vulnerabilidades lógicas se minimizan, se facilita la integración de análisis estático de código y se garantiza que el entorno de ejecución sea reproducible y seguro para todo el equipo.</w:t>
+        <w:jc w:val="both"/>
+        <w:rPr>
+          <w:rFonts w:ascii="Arial" w:eastAsia="Arial" w:hAnsi="Arial" w:cs="Arial"/>
+          <w:color w:val="000000" w:themeColor="text1"/>
+        </w:rPr>
+      </w:pPr>
+      <w:r>
+        <w:rPr>
+          <w:rFonts w:ascii="Arial" w:eastAsia="Arial" w:hAnsi="Arial" w:cs="Arial"/>
+          <w:color w:val="000000" w:themeColor="text1"/>
+        </w:rPr>
+        <w:t xml:space="preserve">En </w:t>
+      </w:r>
+      <w:r>
+        <w:rPr>
+          <w:rFonts w:ascii="Arial" w:eastAsia="Arial" w:hAnsi="Arial" w:cs="Arial"/>
+          <w:color w:val="000000" w:themeColor="text1"/>
+        </w:rPr>
+        <w:t>entornos de desarrollo como NetBeans, la automatización de la arquitectura y el diseño como código optimiza significativamente la eficiencia técnica a través de los siguientes aspectos</w:t>
+      </w:r>
+      <w:r>
+        <w:rPr>
+          <w:rFonts w:ascii="Arial" w:eastAsia="Arial" w:hAnsi="Arial" w:cs="Arial"/>
+          <w:color w:val="000000" w:themeColor="text1"/>
+        </w:rPr>
+        <w:t xml:space="preserve">: </w:t>
+      </w:r>
+    </w:p>
+    <w:p>
+      <w:pPr>
+        <w:ind w:left="360"/>
+        <w:jc w:val="both"/>
+        <w:rPr>
+          <w:rFonts w:ascii="Arial" w:eastAsia="Arial" w:hAnsi="Arial" w:cs="Arial"/>
+        </w:rPr>
+      </w:pPr>
+      <w:r>
+        <w:rPr>
+          <w:rFonts w:ascii="Arial" w:eastAsia="Arial" w:hAnsi="Arial" w:cs="Arial"/>
+        </w:rPr>
+        <w:t>Creación rápida y organizada de la estructura inicial: Permite generar de forma automática las carpetas, paquetes, interfaces y clases principales dentro del IDE. Esto ahorra mucho tiempo entre tareas manuales y repetitivas al iniciar un proyecto, asegurando desde el principio que el código esté bien organizado y cumpla con patrones de diseño conocidos, como MVC (Model – View – Controller).</w:t>
+      </w:r>
+    </w:p>
+    <w:p>
+      <w:pPr>
+        <w:ind w:left="360"/>
+        <w:jc w:val="both"/>
+        <w:rPr>
+          <w:rFonts w:ascii="Arial" w:eastAsia="Arial" w:hAnsi="Arial" w:cs="Arial"/>
+        </w:rPr>
+      </w:pPr>
+      <w:r>
+        <w:rPr>
+          <w:rFonts w:ascii="Arial" w:eastAsia="Arial" w:hAnsi="Arial" w:cs="Arial"/>
+        </w:rPr>
+        <w:t>Facilidad de gestión de librerías y mantenimiento del código: Simplifica la conexión y configuración de herramientas como Maven o Gradle para manejar dependencias sin complicaciones. Además, al tener una estructura limpia y estandarizada desde el inicio, resulta mucho más rápido encontrar errores, hacer cambios, entender el código entre compañeros y darle mantenimiento a futuro.</w:t>
       </w:r>
     </w:p>
     <w:p>
@@ -4116,19 +4134,18 @@
         </w:numPr>
         <w:rPr>
           <w:rFonts w:ascii="Arial" w:eastAsia="Arial" w:hAnsi="Arial" w:cs="Arial"/>
-          <w:highlight w:val="yellow"/>
-        </w:rPr>
-      </w:pPr>
-      <w:r>
-        <w:rPr>
-          <w:rFonts w:ascii="Arial" w:eastAsia="Arial" w:hAnsi="Arial" w:cs="Arial"/>
-          <w:highlight w:val="yellow"/>
+        </w:rPr>
+      </w:pPr>
+      <w:r>
+        <w:rPr>
+          <w:rFonts w:ascii="Arial" w:eastAsia="Arial" w:hAnsi="Arial" w:cs="Arial"/>
         </w:rPr>
         <w:t>¿Por qué la supervisión humana continúa siendo un elemento esencial, aun cuando la IAGen es capaz de generar código, documentación y otros artefactos de software?</w:t>
       </w:r>
     </w:p>
     <w:p>
       <w:pPr>
+        <w:jc w:val="both"/>
         <w:rPr>
           <w:rFonts w:ascii="Arial" w:eastAsia="Arial" w:hAnsi="Arial" w:cs="Arial"/>
         </w:rPr>
@@ -4143,291 +4160,178 @@
         <w:rPr>
           <w:rFonts w:ascii="Arial" w:eastAsia="Arial" w:hAnsi="Arial" w:cs="Arial"/>
         </w:rPr>
-        <w:t>es fundamental por que el criterio técnico y el pensamiento crítico son insustituible frente a las limitaciones de la IAGen. Permite realizar revisiones exhaustivas para detectar errores lógicos, vulnerabilidades de seguridad y alucinaciones que el modelo no reconoce por sí mismo. Además, solo el profesional puede interpretar el contexto real del negocio y aplicar el enfoque de humano en bucle (Human-in-the-Loop), garantizando código y la documentación cumplan con los estándares de calidad y robustez requeridos en producción.</w:t>
-      </w:r>
-    </w:p>
-    <w:p>
-      <w:pPr>
-        <w:rPr>
-          <w:rFonts w:ascii="Arial" w:eastAsia="Arial" w:hAnsi="Arial" w:cs="Arial"/>
-        </w:rPr>
-      </w:pPr>
-      <w:r>
-        <w:rPr>
-          <w:rFonts w:ascii="Arial" w:eastAsia="Arial" w:hAnsi="Arial" w:cs="Arial"/>
-        </w:rPr>
-        <w:t>1.5.3 Actividad práctica</w:t>
-      </w:r>
-    </w:p>
-    <w:p>
-      <w:pPr>
+        <w:t xml:space="preserve">es fundamental por que el criterio técnico y el pensamiento crítico son insustituible frente a las limitaciones de la IAGen. Permite realizar revisiones exhaustivas para detectar errores lógicos, vulnerabilidades de seguridad y </w:t>
+      </w:r>
+      <w:r>
         <w:rPr>
           <w:rFonts w:ascii="Arial" w:eastAsia="Arial" w:hAnsi="Arial" w:cs="Arial"/>
           <w:b/>
           <w:bCs/>
-        </w:rPr>
-      </w:pPr>
-      <w:r>
+          <w:i/>
+          <w:iCs/>
+        </w:rPr>
+        <w:t>alucinaciones</w:t>
+      </w:r>
+      <w:r>
+        <w:rPr>
+          <w:rFonts w:ascii="Arial" w:eastAsia="Arial" w:hAnsi="Arial" w:cs="Arial"/>
+        </w:rPr>
+        <w:t xml:space="preserve"> que el modelo no reconoce por sí mismo. Además, solo el profesional puede interpretar el contexto real del negocio y aplicar el enfoque de humano en bucle (</w:t>
+      </w:r>
+      <w:r>
+        <w:rPr>
+          <w:rFonts w:ascii="Arial" w:eastAsia="Arial" w:hAnsi="Arial" w:cs="Arial"/>
+          <w:color w:val="EE0000"/>
+        </w:rPr>
+        <w:t>Human-in-the-Loop</w:t>
+      </w:r>
+      <w:r>
+        <w:rPr>
+          <w:rFonts w:ascii="Arial" w:eastAsia="Arial" w:hAnsi="Arial" w:cs="Arial"/>
+        </w:rPr>
+        <w:t>), garantizando código y la documentación cumplan con los estándares de calidad y robustez requeridos en producción.</w:t>
+      </w:r>
+    </w:p>
+    <w:p>
+      <w:pPr>
+        <w:rPr>
+          <w:rFonts w:ascii="Arial" w:eastAsia="Arial" w:hAnsi="Arial" w:cs="Arial"/>
+        </w:rPr>
+      </w:pPr>
+      <w:r>
+        <w:rPr>
+          <w:rFonts w:ascii="Arial" w:eastAsia="Arial" w:hAnsi="Arial" w:cs="Arial"/>
+        </w:rPr>
+        <w:t>1.5.3 Actividad práctica</w:t>
+      </w:r>
+    </w:p>
+    <w:p>
+      <w:pPr>
         <w:rPr>
           <w:rFonts w:ascii="Arial" w:eastAsia="Arial" w:hAnsi="Arial" w:cs="Arial"/>
           <w:b/>
           <w:bCs/>
         </w:rPr>
-        <w:t>Análisis de requisitos mediante Ingeniería de Prompts</w:t>
-      </w:r>
-    </w:p>
-    <w:p>
-      <w:pPr>
+      </w:pPr>
+      <w:r>
         <w:rPr>
           <w:rFonts w:ascii="Arial" w:eastAsia="Arial" w:hAnsi="Arial" w:cs="Arial"/>
           <w:b/>
           <w:bCs/>
         </w:rPr>
-      </w:pPr>
-      <w:r>
+        <w:t>Análisis de requisitos mediante Ingeniería de Prompts</w:t>
+      </w:r>
+    </w:p>
+    <w:p>
+      <w:pPr>
         <w:rPr>
           <w:rFonts w:ascii="Arial" w:eastAsia="Arial" w:hAnsi="Arial" w:cs="Arial"/>
           <w:b/>
           <w:bCs/>
         </w:rPr>
-        <w:t>Objetivo</w:t>
-      </w:r>
-    </w:p>
-    <w:p>
-      <w:pPr>
-        <w:rPr>
-          <w:rFonts w:ascii="Arial" w:eastAsia="Arial" w:hAnsi="Arial" w:cs="Arial"/>
-        </w:rPr>
-      </w:pPr>
-      <w:r>
-        <w:rPr>
-          <w:rFonts w:ascii="Arial" w:eastAsia="Arial" w:hAnsi="Arial" w:cs="Arial"/>
-        </w:rPr>
-        <w:t>Aplicar la Inteligencia Artificial Generativa para identificar ambigüedades, inconsistencias y posibles mejoras en una especificación de requisitos de software.</w:t>
-      </w:r>
-    </w:p>
-    <w:p>
-      <w:pPr>
+      </w:pPr>
+      <w:r>
         <w:rPr>
           <w:rFonts w:ascii="Arial" w:eastAsia="Arial" w:hAnsi="Arial" w:cs="Arial"/>
           <w:b/>
           <w:bCs/>
         </w:rPr>
-      </w:pPr>
-      <w:r>
+        <w:t>Objetivo</w:t>
+      </w:r>
+    </w:p>
+    <w:p>
+      <w:pPr>
+        <w:rPr>
+          <w:rFonts w:ascii="Arial" w:eastAsia="Arial" w:hAnsi="Arial" w:cs="Arial"/>
+        </w:rPr>
+      </w:pPr>
+      <w:r>
+        <w:rPr>
+          <w:rFonts w:ascii="Arial" w:eastAsia="Arial" w:hAnsi="Arial" w:cs="Arial"/>
+        </w:rPr>
+        <w:t>Aplicar la Inteligencia Artificial Generativa para identificar ambigüedades, inconsistencias y posibles mejoras en una especificación de requisitos de software.</w:t>
+      </w:r>
+    </w:p>
+    <w:p>
+      <w:pPr>
         <w:rPr>
           <w:rFonts w:ascii="Arial" w:eastAsia="Arial" w:hAnsi="Arial" w:cs="Arial"/>
           <w:b/>
           <w:bCs/>
         </w:rPr>
-        <w:t>Instrucciones</w:t>
-      </w:r>
-    </w:p>
-    <w:p>
-      <w:pPr>
-        <w:rPr>
-          <w:rFonts w:ascii="Arial" w:eastAsia="Arial" w:hAnsi="Arial" w:cs="Arial"/>
-        </w:rPr>
-      </w:pPr>
-      <w:r>
-        <w:rPr>
-          <w:rFonts w:ascii="Arial" w:eastAsia="Arial" w:hAnsi="Arial" w:cs="Arial"/>
-        </w:rPr>
-        <w:t>Seleccione una especificación funcional sencilla (</w:t>
-      </w:r>
-      <w:r>
-        <w:rPr>
-          <w:rFonts w:ascii="Arial" w:eastAsia="Arial" w:hAnsi="Arial" w:cs="Arial"/>
-        </w:rPr>
-        <w:t xml:space="preserve">por ejemplo, un sistema de </w:t>
-      </w:r>
-      <w:r>
-        <w:rPr>
-          <w:rFonts w:ascii="Arial" w:eastAsia="Arial" w:hAnsi="Arial" w:cs="Arial"/>
-        </w:rPr>
-        <w:t>gestión de ventas, productos y clientes “Los Huertos del JuanK”</w:t>
-      </w:r>
-      <w:r>
-        <w:rPr>
-          <w:rFonts w:ascii="Arial" w:eastAsia="Arial" w:hAnsi="Arial" w:cs="Arial"/>
-        </w:rPr>
-        <w:t>).</w:t>
-      </w:r>
-    </w:p>
-    <w:p>
-      <w:pPr>
-        <w:rPr>
-          <w:rFonts w:ascii="Arial" w:eastAsia="Arial" w:hAnsi="Arial" w:cs="Arial"/>
-        </w:rPr>
-      </w:pPr>
-      <w:r>
-        <w:rPr>
-          <w:rFonts w:ascii="Arial" w:eastAsia="Arial" w:hAnsi="Arial" w:cs="Arial"/>
-        </w:rPr>
-        <w:t>Utilice un modelo de lenguaje generativo y formule el siguiente prompt:</w:t>
-      </w:r>
-    </w:p>
-    <w:p>
-      <w:pPr>
-        <w:pStyle w:val="Prrafodelista"/>
-        <w:numPr>
-          <w:ilvl w:val="0"/>
-          <w:numId w:val="3"/>
-        </w:numPr>
-        <w:rPr>
-          <w:rFonts w:ascii="Arial" w:eastAsia="Arial" w:hAnsi="Arial" w:cs="Arial"/>
-        </w:rPr>
-      </w:pPr>
-      <w:r>
-        <w:rPr>
-          <w:rFonts w:ascii="Arial" w:eastAsia="Arial" w:hAnsi="Arial" w:cs="Arial"/>
-          <w:color w:val="548DD4" w:themeColor="text2" w:themeTint="99"/>
-        </w:rPr>
-        <w:t>Actúa como un analista de requisitos de software. Analiza la siguiente especificación funcional e identifica requisitos ambiguos, inconsistentes,. Para cada observación propone una recomendación técnica y justifica brevemente tu respuesta</w:t>
-      </w:r>
-      <w:r>
-        <w:rPr>
-          <w:rFonts w:ascii="Arial" w:eastAsia="Arial" w:hAnsi="Arial" w:cs="Arial"/>
-        </w:rPr>
-        <w:t>,</w:t>
-      </w:r>
-      <w:r>
-        <w:rPr>
-          <w:rFonts w:ascii="Arial" w:eastAsia="Arial" w:hAnsi="Arial" w:cs="Arial"/>
-          <w:color w:val="FF0000"/>
-        </w:rPr>
-        <w:t xml:space="preserve"> exporta a Word como Cap1Eje1</w:t>
-      </w:r>
-    </w:p>
-    <w:p>
-      <w:pPr>
-        <w:pStyle w:val="Prrafodelista"/>
-        <w:rPr>
-          <w:rFonts w:ascii="Arial" w:eastAsia="Arial" w:hAnsi="Arial" w:cs="Arial"/>
-          <w:color w:val="548DD4" w:themeColor="text2" w:themeTint="99"/>
-        </w:rPr>
-      </w:pPr>
-      <w:r>
-        <w:rPr>
-          <w:rFonts w:ascii="Arial" w:eastAsia="Arial" w:hAnsi="Arial" w:cs="Arial"/>
-          <w:color w:val="548DD4" w:themeColor="text2" w:themeTint="99"/>
-        </w:rPr>
-        <w:t>“</w:t>
-      </w:r>
-      <w:r>
-        <w:rPr>
-          <w:rFonts w:ascii="Arial" w:eastAsia="Arial" w:hAnsi="Arial" w:cs="Arial"/>
-          <w:color w:val="548DD4" w:themeColor="text2" w:themeTint="99"/>
-        </w:rPr>
-        <w:t xml:space="preserve">Actúa como un analista de requisitos de software, analiza los siguientes requisitos funcionales, menciona cuales son aquellos que tienen falencias o inconsistencias, adicional realiza una lista de recomendaciones que harías para </w:t>
-      </w:r>
-      <w:r>
-        <w:rPr>
-          <w:rFonts w:ascii="Arial" w:eastAsia="Arial" w:hAnsi="Arial" w:cs="Arial"/>
-          <w:color w:val="548DD4" w:themeColor="text2" w:themeTint="99"/>
-        </w:rPr>
-        <w:lastRenderedPageBreak/>
-        <w:t>mejorar cada observación, todo esto debe ser exportado en un archivo Word con nombre Cap1-Ej1-Analisis.</w:t>
-      </w:r>
-      <w:r>
-        <w:rPr>
-          <w:rFonts w:ascii="Arial" w:eastAsia="Arial" w:hAnsi="Arial" w:cs="Arial"/>
-          <w:color w:val="548DD4" w:themeColor="text2" w:themeTint="99"/>
-        </w:rPr>
-        <w:t>”</w:t>
-      </w:r>
-    </w:p>
-    <w:p>
-      <w:pPr>
-        <w:pStyle w:val="Prrafodelista"/>
-        <w:numPr>
-          <w:ilvl w:val="0"/>
-          <w:numId w:val="3"/>
-        </w:numPr>
-        <w:rPr>
-          <w:rFonts w:ascii="Arial" w:eastAsia="Arial" w:hAnsi="Arial" w:cs="Arial"/>
-          <w:color w:val="548DD4" w:themeColor="text2" w:themeTint="99"/>
-        </w:rPr>
-      </w:pPr>
-      <w:r>
-        <w:rPr>
-          <w:rFonts w:ascii="Arial" w:eastAsia="Arial" w:hAnsi="Arial" w:cs="Arial"/>
-          <w:color w:val="548DD4" w:themeColor="text2" w:themeTint="99"/>
-        </w:rPr>
-        <w:t>Compare los resultados generados por la IA con la especificación original.</w:t>
-      </w:r>
-    </w:p>
-    <w:p>
-      <w:pPr>
-        <w:pStyle w:val="Prrafodelista"/>
-        <w:rPr>
-          <w:rFonts w:ascii="Arial" w:eastAsia="Arial" w:hAnsi="Arial" w:cs="Arial"/>
-          <w:color w:val="548DD4" w:themeColor="text2" w:themeTint="99"/>
-        </w:rPr>
-      </w:pPr>
-      <w:r>
-        <w:rPr>
-          <w:rFonts w:ascii="Arial" w:eastAsia="Arial" w:hAnsi="Arial" w:cs="Arial"/>
-          <w:color w:val="548DD4" w:themeColor="text2" w:themeTint="99"/>
-        </w:rPr>
-        <w:t xml:space="preserve">Los resultados generados por el modelo </w:t>
-      </w:r>
-      <w:r>
-        <w:rPr>
-          <w:rFonts w:ascii="Arial" w:eastAsia="Arial" w:hAnsi="Arial" w:cs="Arial"/>
-          <w:color w:val="548DD4" w:themeColor="text2" w:themeTint="99"/>
-        </w:rPr>
-        <w:t>Gemini 3.7 Flash, analizan eficientemente los requisitos funcionales entregados</w:t>
-      </w:r>
-      <w:r>
-        <w:rPr>
-          <w:rFonts w:ascii="Arial" w:eastAsia="Arial" w:hAnsi="Arial" w:cs="Arial"/>
-          <w:color w:val="548DD4" w:themeColor="text2" w:themeTint="99"/>
-        </w:rPr>
-        <w:t>;</w:t>
-      </w:r>
-      <w:r>
-        <w:rPr>
-          <w:rFonts w:ascii="Arial" w:eastAsia="Arial" w:hAnsi="Arial" w:cs="Arial"/>
-          <w:color w:val="548DD4" w:themeColor="text2" w:themeTint="99"/>
-        </w:rPr>
-        <w:t xml:space="preserve"> en este caso, la versión 9 de los requisitos funcionales de Los Huertos del JuanK</w:t>
-      </w:r>
-    </w:p>
-    <w:p>
-      <w:pPr>
-        <w:pStyle w:val="Prrafodelista"/>
-        <w:numPr>
-          <w:ilvl w:val="0"/>
-          <w:numId w:val="3"/>
-        </w:numPr>
-        <w:rPr>
-          <w:rFonts w:ascii="Arial" w:eastAsia="Arial" w:hAnsi="Arial" w:cs="Arial"/>
-          <w:color w:val="548DD4" w:themeColor="text2" w:themeTint="99"/>
-        </w:rPr>
-      </w:pPr>
-      <w:r>
-        <w:rPr>
-          <w:rFonts w:ascii="Arial" w:eastAsia="Arial" w:hAnsi="Arial" w:cs="Arial"/>
-          <w:color w:val="548DD4" w:themeColor="text2" w:themeTint="99"/>
-        </w:rPr>
-        <w:t>Identifique cuáles observaciones fueron realmente útiles y cuáles requieren corrección por parte del analista.</w:t>
-      </w:r>
-    </w:p>
-    <w:p>
-      <w:pPr>
+      </w:pPr>
+      <w:r>
         <w:rPr>
           <w:rFonts w:ascii="Arial" w:eastAsia="Arial" w:hAnsi="Arial" w:cs="Arial"/>
           <w:b/>
           <w:bCs/>
         </w:rPr>
-      </w:pPr>
-      <w:r>
+        <w:t>Instrucciones</w:t>
+      </w:r>
+    </w:p>
+    <w:p>
+      <w:pPr>
+        <w:rPr>
+          <w:rFonts w:ascii="Arial" w:eastAsia="Arial" w:hAnsi="Arial" w:cs="Arial"/>
+        </w:rPr>
+      </w:pPr>
+      <w:r>
+        <w:rPr>
+          <w:rFonts w:ascii="Arial" w:eastAsia="Arial" w:hAnsi="Arial" w:cs="Arial"/>
+        </w:rPr>
+        <w:t xml:space="preserve">Seleccione una </w:t>
+      </w:r>
+      <w:r>
+        <w:rPr>
+          <w:rFonts w:ascii="Arial" w:eastAsia="Arial" w:hAnsi="Arial" w:cs="Arial"/>
+        </w:rPr>
+        <w:t>ERS (Especificación de requisitos de software) versión 1 y luego con la versión 2. El tutor le proporcionara un Ejemplo.</w:t>
+      </w:r>
+    </w:p>
+    <w:p>
+      <w:pPr>
+        <w:rPr>
+          <w:rFonts w:ascii="Arial" w:eastAsia="Arial" w:hAnsi="Arial" w:cs="Arial"/>
+        </w:rPr>
+      </w:pPr>
+      <w:r>
+        <w:rPr>
+          <w:rFonts w:ascii="Arial" w:eastAsia="Arial" w:hAnsi="Arial" w:cs="Arial"/>
+        </w:rPr>
+        <w:t>Utilice un modelo de lenguaje generativo y formule el siguiente prompt:</w:t>
+      </w:r>
+    </w:p>
+    <w:p>
+      <w:pPr>
+        <w:pStyle w:val="Prrafodelista"/>
         <w:rPr>
           <w:rFonts w:ascii="Arial" w:eastAsia="Arial" w:hAnsi="Arial" w:cs="Arial"/>
           <w:b/>
           <w:bCs/>
         </w:rPr>
+      </w:pPr>
+      <w:r>
+        <w:rPr>
+          <w:rFonts w:ascii="Arial" w:eastAsia="Arial" w:hAnsi="Arial" w:cs="Arial"/>
+          <w:color w:val="548DD4" w:themeColor="text2" w:themeTint="99"/>
+        </w:rPr>
+        <w:t>“Actúa como un analista de requisitos de software, analiza los siguientes requisitos funcionales, menciona cuales son aquellos que tienen falencias o inconsistencias, adicional realiza una lista de recomendaciones que harías para mejorar cada observación, todo esto debe ser exportado en un archivo Word con nombre Cap1-Ej1-Analisis.”</w:t>
+      </w:r>
+    </w:p>
+    <w:p>
+      <w:pPr>
+        <w:rPr>
+          <w:rFonts w:ascii="Arial" w:eastAsia="Arial" w:hAnsi="Arial" w:cs="Arial"/>
+          <w:b/>
+          <w:bCs/>
+        </w:rPr>
+      </w:pPr>
+      <w:r>
+        <w:rPr>
+          <w:rFonts w:ascii="Arial" w:eastAsia="Arial" w:hAnsi="Arial" w:cs="Arial"/>
+          <w:b/>
+          <w:bCs/>
+        </w:rPr>
         <w:t>Resultado esperado</w:t>
       </w:r>
     </w:p>
@@ -4441,7 +4345,53 @@
         <w:rPr>
           <w:rFonts w:ascii="Arial" w:eastAsia="Arial" w:hAnsi="Arial" w:cs="Arial"/>
         </w:rPr>
-        <w:t>El estudiante comprenderá que la IAGen constituye una herramienta de apoyo para el análisis de requisitos, pero que la validación final continúa siendo responsabilidad del ingeniero de software</w:t>
+        <w:lastRenderedPageBreak/>
+        <w:t>Realizar una Guía de análisis de los documento de ERS versiones 1 y 2 con el objetivo de</w:t>
+      </w:r>
+      <w:proofErr w:type="gramStart"/>
+      <w:r>
+        <w:rPr>
+          <w:rFonts w:ascii="Arial" w:eastAsia="Arial" w:hAnsi="Arial" w:cs="Arial"/>
+        </w:rPr>
+        <w:t xml:space="preserve"> ….</w:t>
+      </w:r>
+      <w:proofErr w:type="gramEnd"/>
+      <w:r>
+        <w:rPr>
+          <w:rFonts w:ascii="Arial" w:eastAsia="Arial" w:hAnsi="Arial" w:cs="Arial"/>
+        </w:rPr>
+        <w:t>.</w:t>
+      </w:r>
+    </w:p>
+    <w:p>
+      <w:pPr>
+        <w:rPr>
+          <w:rFonts w:ascii="Arial" w:eastAsia="Arial" w:hAnsi="Arial" w:cs="Arial"/>
+        </w:rPr>
+      </w:pPr>
+      <w:r>
+        <w:rPr>
+          <w:rFonts w:ascii="Arial" w:eastAsia="Arial" w:hAnsi="Arial" w:cs="Arial"/>
+        </w:rPr>
+        <w:t>El estudiante comprenderá que la IAGen constituye una herramienta de apoyo para el análisis de requisitos</w:t>
+      </w:r>
+      <w:r>
+        <w:rPr>
+          <w:rFonts w:ascii="Arial" w:eastAsia="Arial" w:hAnsi="Arial" w:cs="Arial"/>
+        </w:rPr>
+        <w:t xml:space="preserve"> funcionales</w:t>
+      </w:r>
+      <w:r>
+        <w:rPr>
+          <w:rFonts w:ascii="Arial" w:eastAsia="Arial" w:hAnsi="Arial" w:cs="Arial"/>
+        </w:rPr>
+        <w:t>, pero que la validación final continúa siendo responsabilidad del ingeniero de software</w:t>
+      </w:r>
+      <w:r>
+        <w:rPr>
+          <w:rFonts w:ascii="Arial" w:eastAsia="Arial" w:hAnsi="Arial" w:cs="Arial"/>
+        </w:rPr>
+        <w:t>, o cualquier profesional que necesite verificar los resultados.</w:t>
       </w:r>
     </w:p>
     <w:p>
@@ -4657,7 +4607,6 @@
         <w:rPr>
           <w:rFonts w:ascii="Arial" w:eastAsia="Arial" w:hAnsi="Arial" w:cs="Arial"/>
         </w:rPr>
-        <w:lastRenderedPageBreak/>
         <w:t>Nota de figura</w:t>
       </w:r>
       <w:r>
@@ -4695,6 +4644,7 @@
         <w:rPr>
           <w:rFonts w:ascii="Arial" w:eastAsia="Arial" w:hAnsi="Arial" w:cs="Arial"/>
         </w:rPr>
+        <w:lastRenderedPageBreak/>
         <w:t xml:space="preserve">Esposito, M., Robredo, M., Bakhtin, A., Taibi, D., &amp; Lenarduzzi, V. (2026). </w:t>
       </w:r>
       <w:r>
@@ -7088,6 +7038,7 @@
   <w:style w:type="character" w:default="1" w:styleId="Fuentedeprrafopredeter">
     <w:name w:val="Default Paragraph Font"/>
     <w:uiPriority w:val="1"/>
+    <w:semiHidden/>
     <w:unhideWhenUsed/>
   </w:style>
   <w:style w:type="table" w:default="1" w:styleId="Tablanormal">

</xml_diff>